<commit_message>
Did some changes in the original document
</commit_message>
<xml_diff>
--- a/Weekly_Reports/Week_02_Report.docx
+++ b/Weekly_Reports/Week_02_Report.docx
@@ -1,6 +1,6 @@
 
 <file path=word/document.xml><?xml version="1.0" encoding="utf-8"?>
-<w:document xmlns:wpc="http://schemas.microsoft.com/office/word/2010/wordprocessingCanvas" xmlns:cx="http://schemas.microsoft.com/office/drawing/2014/chartex" xmlns:cx1="http://schemas.microsoft.com/office/drawing/2015/9/8/chartex" xmlns:cx2="http://schemas.microsoft.com/office/drawing/2015/10/21/chartex" xmlns:cx3="http://schemas.microsoft.com/office/drawing/2016/5/9/chartex" xmlns:cx4="http://schemas.microsoft.com/office/drawing/2016/5/10/chartex" xmlns:cx5="http://schemas.microsoft.com/office/drawing/2016/5/11/chartex" xmlns:cx6="http://schemas.microsoft.com/office/drawing/2016/5/12/chartex" xmlns:cx7="http://schemas.microsoft.com/office/drawing/2016/5/13/chartex" xmlns:cx8="http://schemas.microsoft.com/office/drawing/2016/5/14/chartex" xmlns:mc="http://schemas.openxmlformats.org/markup-compatibility/2006" xmlns:aink="http://schemas.microsoft.com/office/drawing/2016/ink" xmlns:am3d="http://schemas.microsoft.com/office/drawing/2017/model3d" xmlns:o="urn:schemas-microsoft-com:office:office" xmlns:r="http://schemas.openxmlformats.org/officeDocument/2006/relationships" xmlns:m="http://schemas.openxmlformats.org/officeDocument/2006/math" xmlns:v="urn:schemas-microsoft-com:vml" xmlns:wp14="http://schemas.microsoft.com/office/word/2010/wordprocessingDrawing" xmlns:wp="http://schemas.openxmlformats.org/drawingml/2006/wordprocessingDrawing" xmlns:w10="urn:schemas-microsoft-com:office:word" xmlns:w="http://schemas.openxmlformats.org/wordprocessingml/2006/main" xmlns:w14="http://schemas.microsoft.com/office/word/2010/wordml" xmlns:w15="http://schemas.microsoft.com/office/word/2012/wordml" xmlns:w16cex="http://schemas.microsoft.com/office/word/2018/wordml/cex" xmlns:w16cid="http://schemas.microsoft.com/office/word/2016/wordml/cid" xmlns:w16="http://schemas.microsoft.com/office/word/2018/wordml" xmlns:w16sdtdh="http://schemas.microsoft.com/office/word/2020/wordml/sdtdatahash" xmlns:w16se="http://schemas.microsoft.com/office/word/2015/wordml/symex" xmlns:wpg="http://schemas.microsoft.com/office/word/2010/wordprocessingGroup" xmlns:wpi="http://schemas.microsoft.com/office/word/2010/wordprocessingInk" xmlns:wne="http://schemas.microsoft.com/office/word/2006/wordml" xmlns:wps="http://schemas.microsoft.com/office/word/2010/wordprocessingShape" mc:Ignorable="w14 w15 w16se w16cid w16 w16cex w16sdtdh wp14">
+<w:document xmlns:wpc="http://schemas.microsoft.com/office/word/2010/wordprocessingCanvas" xmlns:cx="http://schemas.microsoft.com/office/drawing/2014/chartex" xmlns:cx1="http://schemas.microsoft.com/office/drawing/2015/9/8/chartex" xmlns:cx2="http://schemas.microsoft.com/office/drawing/2015/10/21/chartex" xmlns:cx3="http://schemas.microsoft.com/office/drawing/2016/5/9/chartex" xmlns:cx4="http://schemas.microsoft.com/office/drawing/2016/5/10/chartex" xmlns:cx5="http://schemas.microsoft.com/office/drawing/2016/5/11/chartex" xmlns:cx6="http://schemas.microsoft.com/office/drawing/2016/5/12/chartex" xmlns:cx7="http://schemas.microsoft.com/office/drawing/2016/5/13/chartex" xmlns:cx8="http://schemas.microsoft.com/office/drawing/2016/5/14/chartex" xmlns:mc="http://schemas.openxmlformats.org/markup-compatibility/2006" xmlns:aink="http://schemas.microsoft.com/office/drawing/2016/ink" xmlns:am3d="http://schemas.microsoft.com/office/drawing/2017/model3d" xmlns:o="urn:schemas-microsoft-com:office:office" xmlns:oel="http://schemas.microsoft.com/office/2019/extlst" xmlns:r="http://schemas.openxmlformats.org/officeDocument/2006/relationships" xmlns:m="http://schemas.openxmlformats.org/officeDocument/2006/math" xmlns:v="urn:schemas-microsoft-com:vml" xmlns:wp14="http://schemas.microsoft.com/office/word/2010/wordprocessingDrawing" xmlns:wp="http://schemas.openxmlformats.org/drawingml/2006/wordprocessingDrawing" xmlns:w10="urn:schemas-microsoft-com:office:word" xmlns:w="http://schemas.openxmlformats.org/wordprocessingml/2006/main" xmlns:w14="http://schemas.microsoft.com/office/word/2010/wordml" xmlns:w15="http://schemas.microsoft.com/office/word/2012/wordml" xmlns:w16cex="http://schemas.microsoft.com/office/word/2018/wordml/cex" xmlns:w16cid="http://schemas.microsoft.com/office/word/2016/wordml/cid" xmlns:w16="http://schemas.microsoft.com/office/word/2018/wordml" xmlns:w16du="http://schemas.microsoft.com/office/word/2023/wordml/word16du" xmlns:w16sdtdh="http://schemas.microsoft.com/office/word/2020/wordml/sdtdatahash" xmlns:w16sdtfl="http://schemas.microsoft.com/office/word/2024/wordml/sdtformatlock" xmlns:w16se="http://schemas.microsoft.com/office/word/2015/wordml/symex" xmlns:wpg="http://schemas.microsoft.com/office/word/2010/wordprocessingGroup" xmlns:wpi="http://schemas.microsoft.com/office/word/2010/wordprocessingInk" xmlns:wne="http://schemas.microsoft.com/office/word/2006/wordml" xmlns:wps="http://schemas.microsoft.com/office/word/2010/wordprocessingShape" mc:Ignorable="w14 w15 w16se w16cid w16 w16cex w16sdtdh w16sdtfl w16du wp14">
   <w:body>
     <w:p>
       <w:pPr>
@@ -67,12 +67,6 @@
         <w:gridCol w:w="6720"/>
       </w:tblGrid>
       <w:tr>
-        <w:tblPrEx>
-          <w:tblCellMar>
-            <w:top w:w="0" w:type="dxa"/>
-            <w:bottom w:w="0" w:type="dxa"/>
-          </w:tblCellMar>
-        </w:tblPrEx>
         <w:tc>
           <w:tcPr>
             <w:tcW w:w="3060" w:type="dxa"/>
@@ -127,12 +121,6 @@
         </w:tc>
       </w:tr>
       <w:tr>
-        <w:tblPrEx>
-          <w:tblCellMar>
-            <w:top w:w="0" w:type="dxa"/>
-            <w:bottom w:w="0" w:type="dxa"/>
-          </w:tblCellMar>
-        </w:tblPrEx>
         <w:tc>
           <w:tcPr>
             <w:tcW w:w="3060" w:type="dxa"/>
@@ -177,12 +165,6 @@
         </w:tc>
       </w:tr>
       <w:tr>
-        <w:tblPrEx>
-          <w:tblCellMar>
-            <w:top w:w="0" w:type="dxa"/>
-            <w:bottom w:w="0" w:type="dxa"/>
-          </w:tblCellMar>
-        </w:tblPrEx>
         <w:tc>
           <w:tcPr>
             <w:tcW w:w="3060" w:type="dxa"/>
@@ -216,12 +198,21 @@
             </w:tcBorders>
           </w:tcPr>
           <w:p>
-            <w:r>
-              <w:rPr>
-                <w:sz w:val="21"/>
-                <w:szCs w:val="21"/>
-              </w:rPr>
-              <w:t>YieldSAT, Group B (Argentina and Brazil)</w:t>
+            <w:proofErr w:type="spellStart"/>
+            <w:r>
+              <w:rPr>
+                <w:sz w:val="21"/>
+                <w:szCs w:val="21"/>
+              </w:rPr>
+              <w:t>YieldSAT</w:t>
+            </w:r>
+            <w:proofErr w:type="spellEnd"/>
+            <w:r>
+              <w:rPr>
+                <w:sz w:val="21"/>
+                <w:szCs w:val="21"/>
+              </w:rPr>
+              <w:t>, Group B (Argentina and Brazil)</w:t>
             </w:r>
           </w:p>
         </w:tc>
@@ -264,12 +255,6 @@
         <w:gridCol w:w="4080"/>
       </w:tblGrid>
       <w:tr>
-        <w:tblPrEx>
-          <w:tblCellMar>
-            <w:top w:w="0" w:type="dxa"/>
-            <w:bottom w:w="0" w:type="dxa"/>
-          </w:tblCellMar>
-        </w:tblPrEx>
         <w:tc>
           <w:tcPr>
             <w:tcW w:w="3600" w:type="dxa"/>
@@ -338,12 +323,6 @@
         </w:tc>
       </w:tr>
       <w:tr>
-        <w:tblPrEx>
-          <w:tblCellMar>
-            <w:top w:w="0" w:type="dxa"/>
-            <w:bottom w:w="0" w:type="dxa"/>
-          </w:tblCellMar>
-        </w:tblPrEx>
         <w:tc>
           <w:tcPr>
             <w:tcW w:w="3600" w:type="dxa"/>
@@ -406,12 +385,6 @@
         </w:tc>
       </w:tr>
       <w:tr>
-        <w:tblPrEx>
-          <w:tblCellMar>
-            <w:top w:w="0" w:type="dxa"/>
-            <w:bottom w:w="0" w:type="dxa"/>
-          </w:tblCellMar>
-        </w:tblPrEx>
         <w:tc>
           <w:tcPr>
             <w:tcW w:w="3600" w:type="dxa"/>
@@ -474,12 +447,6 @@
         </w:tc>
       </w:tr>
       <w:tr>
-        <w:tblPrEx>
-          <w:tblCellMar>
-            <w:top w:w="0" w:type="dxa"/>
-            <w:bottom w:w="0" w:type="dxa"/>
-          </w:tblCellMar>
-        </w:tblPrEx>
         <w:tc>
           <w:tcPr>
             <w:tcW w:w="3600" w:type="dxa"/>
@@ -542,12 +509,6 @@
         </w:tc>
       </w:tr>
       <w:tr>
-        <w:tblPrEx>
-          <w:tblCellMar>
-            <w:top w:w="0" w:type="dxa"/>
-            <w:bottom w:w="0" w:type="dxa"/>
-          </w:tblCellMar>
-        </w:tblPrEx>
         <w:tc>
           <w:tcPr>
             <w:tcW w:w="3600" w:type="dxa"/>
@@ -636,7 +597,39 @@
         <w:spacing w:after="80"/>
       </w:pPr>
       <w:r>
-        <w:t>We installed the Python tools we need. These are rasterio, geopandas, shapely, pyproj, scikit-image, scikit-learn and earthengine-api.</w:t>
+        <w:t xml:space="preserve">We installed the Python tools we need. These are </w:t>
+      </w:r>
+      <w:proofErr w:type="spellStart"/>
+      <w:r>
+        <w:t>rasterio</w:t>
+      </w:r>
+      <w:proofErr w:type="spellEnd"/>
+      <w:r>
+        <w:t xml:space="preserve">, </w:t>
+      </w:r>
+      <w:proofErr w:type="spellStart"/>
+      <w:r>
+        <w:t>geopandas</w:t>
+      </w:r>
+      <w:proofErr w:type="spellEnd"/>
+      <w:r>
+        <w:t xml:space="preserve">, shapely, </w:t>
+      </w:r>
+      <w:proofErr w:type="spellStart"/>
+      <w:r>
+        <w:t>pyproj</w:t>
+      </w:r>
+      <w:proofErr w:type="spellEnd"/>
+      <w:r>
+        <w:t xml:space="preserve">, scikit-image, scikit-learn and </w:t>
+      </w:r>
+      <w:proofErr w:type="spellStart"/>
+      <w:r>
+        <w:t>earthengine-api</w:t>
+      </w:r>
+      <w:proofErr w:type="spellEnd"/>
+      <w:r>
+        <w:t>.</w:t>
       </w:r>
     </w:p>
     <w:p>
@@ -662,10 +655,7 @@
         <w:spacing w:after="80"/>
       </w:pPr>
       <w:r>
-        <w:t xml:space="preserve">We made a folder structure inside Codes. It has separate folders for </w:t>
-      </w:r>
-      <w:r>
-        <w:t>data, preprocessing, features, models and evaluation.</w:t>
+        <w:t>We made a folder structure inside Codes. It has separate folders for data, preprocessing, features, models and evaluation.</w:t>
       </w:r>
     </w:p>
     <w:p>
@@ -678,10 +668,23 @@
         <w:spacing w:after="80"/>
       </w:pPr>
       <w:r>
-        <w:t>We made a simple manifest format. It stores the field ID, country, crop type and file paths. We do not know the real YieldSAT file layout yet. So we made our own format first, and we can adjust it later</w:t>
-      </w:r>
-      <w:r>
-        <w:t>.</w:t>
+        <w:t xml:space="preserve">We made a simple manifest format. It stores the field ID, country, crop type and file paths. We do not know the real </w:t>
+      </w:r>
+      <w:proofErr w:type="spellStart"/>
+      <w:r>
+        <w:t>YieldSAT</w:t>
+      </w:r>
+      <w:proofErr w:type="spellEnd"/>
+      <w:r>
+        <w:t xml:space="preserve"> file layout yet. </w:t>
+      </w:r>
+      <w:proofErr w:type="gramStart"/>
+      <w:r>
+        <w:t>So</w:t>
+      </w:r>
+      <w:proofErr w:type="gramEnd"/>
+      <w:r>
+        <w:t xml:space="preserve"> we made our own format first, and we can adjust it later.</w:t>
       </w:r>
     </w:p>
     <w:p>
@@ -694,13 +697,7 @@
         <w:spacing w:after="80"/>
       </w:pPr>
       <w:r>
-        <w:t>We made sample synthetic</w:t>
-      </w:r>
-      <w:r>
-        <w:t xml:space="preserve"> data to test our code. This has synthetic</w:t>
-      </w:r>
-      <w:r>
-        <w:t xml:space="preserve"> optical images and fake SAR images.</w:t>
+        <w:t>We made sample synthetic data to test our code. This has synthetic optical images and fake SAR images.</w:t>
       </w:r>
     </w:p>
     <w:p>
@@ -713,10 +710,7 @@
         <w:spacing w:after="80"/>
       </w:pPr>
       <w:r>
-        <w:t>We ran our code on this synthetic</w:t>
-      </w:r>
-      <w:r>
-        <w:t xml:space="preserve"> data. We read the images back. We computed NDVI from them. We saved a picture showing the results.</w:t>
+        <w:t>We ran our code on this synthetic data. We read the images back. We computed NDVI from them. We saved a picture showing the results.</w:t>
       </w:r>
     </w:p>
     <w:p>
@@ -729,10 +723,7 @@
         <w:spacing w:after="80"/>
       </w:pPr>
       <w:r>
-        <w:t xml:space="preserve">We wrote tests for our code. All </w:t>
-      </w:r>
-      <w:r>
-        <w:t>four tests pass.</w:t>
+        <w:t>We wrote tests for our code. All four tests pass.</w:t>
       </w:r>
     </w:p>
     <w:p>
@@ -745,7 +736,10 @@
         <w:spacing w:after="80"/>
       </w:pPr>
       <w:r>
-        <w:t>We set up Google Earth Engine and checked it works. We searched for real Sentinel-1 images over a sample area in Argentina and found 5 images.</w:t>
+        <w:t xml:space="preserve">We </w:t>
+      </w:r>
+      <w:r>
+        <w:t>searched for real Sentinel-1 images over a sample area in Argentina and found 5 images.</w:t>
       </w:r>
     </w:p>
     <w:p>
@@ -769,10 +763,34 @@
         <w:spacing w:after="120"/>
       </w:pPr>
       <w:r>
-        <w:t>This week we read tool documentation more than research papers, since our focu</w:t>
-      </w:r>
-      <w:r>
-        <w:t>s was on setting up the environment. We read the rasterio, geopandas and scikit-image documentation to plan the next steps.</w:t>
+        <w:t xml:space="preserve">This week we read tool documentation more than research papers, since our focus was on setting up the environment. We read the </w:t>
+      </w:r>
+      <w:proofErr w:type="spellStart"/>
+      <w:r>
+        <w:t>rasterio</w:t>
+      </w:r>
+      <w:proofErr w:type="spellEnd"/>
+      <w:r>
+        <w:t xml:space="preserve">, </w:t>
+      </w:r>
+      <w:proofErr w:type="spellStart"/>
+      <w:r>
+        <w:t>geopandas</w:t>
+      </w:r>
+      <w:proofErr w:type="spellEnd"/>
+      <w:r>
+        <w:t xml:space="preserve">, </w:t>
+      </w:r>
+      <w:proofErr w:type="spellStart"/>
+      <w:r>
+        <w:t>pyproj</w:t>
+      </w:r>
+      <w:proofErr w:type="spellEnd"/>
+      <w:r>
+        <w:t xml:space="preserve"> 3.7.2</w:t>
+      </w:r>
+      <w:r>
+        <w:t xml:space="preserve"> and scikit documentation to plan the next steps.</w:t>
       </w:r>
     </w:p>
     <w:p>
@@ -780,10 +798,23 @@
         <w:spacing w:after="120"/>
       </w:pPr>
       <w:r>
-        <w:t>We also checked the YieldSAT paper again. It confirmed that YieldSAT does not include SAR data. This is why we need to collect our o</w:t>
-      </w:r>
-      <w:r>
-        <w:t>wn Sentinel-1 data. We plan to read more papers on SAR and optical fusion methods.</w:t>
+        <w:t xml:space="preserve">We also checked the </w:t>
+      </w:r>
+      <w:proofErr w:type="spellStart"/>
+      <w:r>
+        <w:t>YieldSAT</w:t>
+      </w:r>
+      <w:proofErr w:type="spellEnd"/>
+      <w:r>
+        <w:t xml:space="preserve"> paper again. It confirmed that </w:t>
+      </w:r>
+      <w:proofErr w:type="spellStart"/>
+      <w:r>
+        <w:t>YieldSAT</w:t>
+      </w:r>
+      <w:proofErr w:type="spellEnd"/>
+      <w:r>
+        <w:t xml:space="preserve"> does not include SAR data. We plan to read more papers on SAR and optical fusion methods.</w:t>
       </w:r>
     </w:p>
     <w:p>
@@ -812,23 +843,7 @@
         <w:spacing w:after="80"/>
       </w:pPr>
       <w:r>
-        <w:t>Ask the other team members to also set up Google Earth Engine.</w:t>
-      </w:r>
-    </w:p>
-    <w:p>
-      <w:pPr>
-        <w:pStyle w:val="ListParagraph"/>
-        <w:numPr>
-          <w:ilvl w:val="0"/>
-          <w:numId w:val="2"/>
-        </w:numPr>
-        <w:spacing w:after="80"/>
-      </w:pPr>
-      <w:r>
-        <w:t>Start the real optical data pipel</w:t>
-      </w:r>
-      <w:r>
-        <w:t>ine. This means cutting images to the field shape and removing clouds.</w:t>
+        <w:t>Start the real optical data pipeline. This means cutting images to the field shape and removing clouds.</w:t>
       </w:r>
     </w:p>
     <w:p>
@@ -870,7 +885,15 @@
         <w:spacing w:after="80"/>
       </w:pPr>
       <w:r>
-        <w:t>We still do not have the real YieldSAT dataset. Our request is still pending.</w:t>
+        <w:t xml:space="preserve">We still do not have the real </w:t>
+      </w:r>
+      <w:proofErr w:type="spellStart"/>
+      <w:r>
+        <w:t>YieldSAT</w:t>
+      </w:r>
+      <w:proofErr w:type="spellEnd"/>
+      <w:r>
+        <w:t xml:space="preserve"> dataset. Our request is still pending.</w:t>
       </w:r>
     </w:p>
     <w:p>
@@ -883,23 +906,7 @@
         <w:spacing w:after="80"/>
       </w:pPr>
       <w:r>
-        <w:t>We do not know the exact file structure</w:t>
-      </w:r>
-      <w:r>
-        <w:t xml:space="preserve"> of the real dataset yet.</w:t>
-      </w:r>
-    </w:p>
-    <w:p>
-      <w:pPr>
-        <w:pStyle w:val="ListParagraph"/>
-        <w:numPr>
-          <w:ilvl w:val="0"/>
-          <w:numId w:val="2"/>
-        </w:numPr>
-        <w:spacing w:after="80"/>
-      </w:pPr>
-      <w:r>
-        <w:t>Only one team member has set up Google Earth Engine so far.</w:t>
+        <w:t>We do not know the exact file structure of the real dataset yet.</w:t>
       </w:r>
     </w:p>
     <w:sectPr>
@@ -913,7 +920,7 @@
 </file>
 
 <file path=word/numbering.xml><?xml version="1.0" encoding="utf-8"?>
-<w:numbering xmlns:wpc="http://schemas.microsoft.com/office/word/2010/wordprocessingCanvas" xmlns:cx="http://schemas.microsoft.com/office/drawing/2014/chartex" xmlns:cx1="http://schemas.microsoft.com/office/drawing/2015/9/8/chartex" xmlns:cx2="http://schemas.microsoft.com/office/drawing/2015/10/21/chartex" xmlns:cx3="http://schemas.microsoft.com/office/drawing/2016/5/9/chartex" xmlns:cx4="http://schemas.microsoft.com/office/drawing/2016/5/10/chartex" xmlns:cx5="http://schemas.microsoft.com/office/drawing/2016/5/11/chartex" xmlns:cx6="http://schemas.microsoft.com/office/drawing/2016/5/12/chartex" xmlns:cx7="http://schemas.microsoft.com/office/drawing/2016/5/13/chartex" xmlns:cx8="http://schemas.microsoft.com/office/drawing/2016/5/14/chartex" xmlns:mc="http://schemas.openxmlformats.org/markup-compatibility/2006" xmlns:aink="http://schemas.microsoft.com/office/drawing/2016/ink" xmlns:am3d="http://schemas.microsoft.com/office/drawing/2017/model3d" xmlns:o="urn:schemas-microsoft-com:office:office" xmlns:r="http://schemas.openxmlformats.org/officeDocument/2006/relationships" xmlns:m="http://schemas.openxmlformats.org/officeDocument/2006/math" xmlns:v="urn:schemas-microsoft-com:vml" xmlns:wp14="http://schemas.microsoft.com/office/word/2010/wordprocessingDrawing" xmlns:wp="http://schemas.openxmlformats.org/drawingml/2006/wordprocessingDrawing" xmlns:w10="urn:schemas-microsoft-com:office:word" xmlns:w="http://schemas.openxmlformats.org/wordprocessingml/2006/main" xmlns:w14="http://schemas.microsoft.com/office/word/2010/wordml" xmlns:w15="http://schemas.microsoft.com/office/word/2012/wordml" xmlns:w16cex="http://schemas.microsoft.com/office/word/2018/wordml/cex" xmlns:w16cid="http://schemas.microsoft.com/office/word/2016/wordml/cid" xmlns:w16="http://schemas.microsoft.com/office/word/2018/wordml" xmlns:w16sdtdh="http://schemas.microsoft.com/office/word/2020/wordml/sdtdatahash" xmlns:w16se="http://schemas.microsoft.com/office/word/2015/wordml/symex" xmlns:wpg="http://schemas.microsoft.com/office/word/2010/wordprocessingGroup" xmlns:wpi="http://schemas.microsoft.com/office/word/2010/wordprocessingInk" xmlns:wne="http://schemas.microsoft.com/office/word/2006/wordml" xmlns:wps="http://schemas.microsoft.com/office/word/2010/wordprocessingShape" mc:Ignorable="w14 w15 w16se w16cid w16 w16cex w16sdtdh wp14">
+<w:numbering xmlns:wpc="http://schemas.microsoft.com/office/word/2010/wordprocessingCanvas" xmlns:cx="http://schemas.microsoft.com/office/drawing/2014/chartex" xmlns:cx1="http://schemas.microsoft.com/office/drawing/2015/9/8/chartex" xmlns:cx2="http://schemas.microsoft.com/office/drawing/2015/10/21/chartex" xmlns:cx3="http://schemas.microsoft.com/office/drawing/2016/5/9/chartex" xmlns:cx4="http://schemas.microsoft.com/office/drawing/2016/5/10/chartex" xmlns:cx5="http://schemas.microsoft.com/office/drawing/2016/5/11/chartex" xmlns:cx6="http://schemas.microsoft.com/office/drawing/2016/5/12/chartex" xmlns:cx7="http://schemas.microsoft.com/office/drawing/2016/5/13/chartex" xmlns:cx8="http://schemas.microsoft.com/office/drawing/2016/5/14/chartex" xmlns:mc="http://schemas.openxmlformats.org/markup-compatibility/2006" xmlns:aink="http://schemas.microsoft.com/office/drawing/2016/ink" xmlns:am3d="http://schemas.microsoft.com/office/drawing/2017/model3d" xmlns:o="urn:schemas-microsoft-com:office:office" xmlns:oel="http://schemas.microsoft.com/office/2019/extlst" xmlns:r="http://schemas.openxmlformats.org/officeDocument/2006/relationships" xmlns:m="http://schemas.openxmlformats.org/officeDocument/2006/math" xmlns:v="urn:schemas-microsoft-com:vml" xmlns:wp14="http://schemas.microsoft.com/office/word/2010/wordprocessingDrawing" xmlns:wp="http://schemas.openxmlformats.org/drawingml/2006/wordprocessingDrawing" xmlns:w10="urn:schemas-microsoft-com:office:word" xmlns:w="http://schemas.openxmlformats.org/wordprocessingml/2006/main" xmlns:w14="http://schemas.microsoft.com/office/word/2010/wordml" xmlns:w15="http://schemas.microsoft.com/office/word/2012/wordml" xmlns:w16cex="http://schemas.microsoft.com/office/word/2018/wordml/cex" xmlns:w16cid="http://schemas.microsoft.com/office/word/2016/wordml/cid" xmlns:w16="http://schemas.microsoft.com/office/word/2018/wordml" xmlns:w16du="http://schemas.microsoft.com/office/word/2023/wordml/word16du" xmlns:w16sdtdh="http://schemas.microsoft.com/office/word/2020/wordml/sdtdatahash" xmlns:w16sdtfl="http://schemas.microsoft.com/office/word/2024/wordml/sdtformatlock" xmlns:w16se="http://schemas.microsoft.com/office/word/2015/wordml/symex" xmlns:wpg="http://schemas.microsoft.com/office/word/2010/wordprocessingGroup" xmlns:wpi="http://schemas.microsoft.com/office/word/2010/wordprocessingInk" xmlns:wne="http://schemas.microsoft.com/office/word/2006/wordml" xmlns:wps="http://schemas.microsoft.com/office/word/2010/wordprocessingShape" mc:Ignorable="w14 w15 w16se w16cid w16 w16cex w16sdtdh w16sdtfl w16du wp14">
   <w:abstractNum w:abstractNumId="0" w15:restartNumberingAfterBreak="0">
     <w:nsid w:val="3DA355FB"/>
     <w:multiLevelType w:val="hybridMultilevel"/>
@@ -1054,13 +1061,13 @@
       </w:pPr>
     </w:lvl>
   </w:abstractNum>
-  <w:num w:numId="1">
+  <w:num w:numId="1" w16cid:durableId="877887203">
     <w:abstractNumId w:val="1"/>
     <w:lvlOverride w:ilvl="0">
       <w:startOverride w:val="1"/>
     </w:lvlOverride>
   </w:num>
-  <w:num w:numId="2">
+  <w:num w:numId="2" w16cid:durableId="2130975406">
     <w:abstractNumId w:val="0"/>
     <w:lvlOverride w:ilvl="0">
       <w:startOverride w:val="1"/>
@@ -1070,7 +1077,7 @@
 </file>
 
 <file path=word/styles.xml><?xml version="1.0" encoding="utf-8"?>
-<w:styles xmlns:mc="http://schemas.openxmlformats.org/markup-compatibility/2006" xmlns:r="http://schemas.openxmlformats.org/officeDocument/2006/relationships" xmlns:w="http://schemas.openxmlformats.org/wordprocessingml/2006/main" xmlns:w14="http://schemas.microsoft.com/office/word/2010/wordml" xmlns:w15="http://schemas.microsoft.com/office/word/2012/wordml" xmlns:w16cex="http://schemas.microsoft.com/office/word/2018/wordml/cex" xmlns:w16cid="http://schemas.microsoft.com/office/word/2016/wordml/cid" xmlns:w16="http://schemas.microsoft.com/office/word/2018/wordml" xmlns:w16sdtdh="http://schemas.microsoft.com/office/word/2020/wordml/sdtdatahash" xmlns:w16se="http://schemas.microsoft.com/office/word/2015/wordml/symex" mc:Ignorable="w14 w15 w16se w16cid w16 w16cex w16sdtdh">
+<w:styles xmlns:mc="http://schemas.openxmlformats.org/markup-compatibility/2006" xmlns:r="http://schemas.openxmlformats.org/officeDocument/2006/relationships" xmlns:w="http://schemas.openxmlformats.org/wordprocessingml/2006/main" xmlns:w14="http://schemas.microsoft.com/office/word/2010/wordml" xmlns:w15="http://schemas.microsoft.com/office/word/2012/wordml" xmlns:w16cex="http://schemas.microsoft.com/office/word/2018/wordml/cex" xmlns:w16cid="http://schemas.microsoft.com/office/word/2016/wordml/cid" xmlns:w16="http://schemas.microsoft.com/office/word/2018/wordml" xmlns:w16du="http://schemas.microsoft.com/office/word/2023/wordml/word16du" xmlns:w16sdtdh="http://schemas.microsoft.com/office/word/2020/wordml/sdtdatahash" xmlns:w16sdtfl="http://schemas.microsoft.com/office/word/2024/wordml/sdtformatlock" xmlns:w16se="http://schemas.microsoft.com/office/word/2015/wordml/symex" mc:Ignorable="w14 w15 w16se w16cid w16 w16cex w16sdtdh w16sdtfl w16du">
   <w:docDefaults>
     <w:rPrDefault>
       <w:rPr>

</xml_diff>